<commit_message>
Add generative AI use policy, new LaTeX template, and README cleanup
- Add an AI Use Disclosure requirement (Pangram screening, best-paper
  disqualification for excessive reliance) to the site's formatting
  section and to the Word template's front matter
- Add a new LaTeX template mirroring the Word formatting, with an
  "Open in Overleaf" button so authors no longer depend on the old
  gallery template
- Fix the Word template's formatting-questions mailto link
- README: drop stale contact-placeholder note, document templates and
  the AI policy

Co-Authored-By: Claude Opus 5.5 <noreply@anthropic.com>
Claude-Session: https://claude.ai/code/session_01JHp3dG7BHjUqck1HCFwd7M
</commit_message>
<xml_diff>
--- a/files/GDRKMCC-27_Paper_Template.docx
+++ b/files/GDRKMCC-27_Paper_Template.docx
@@ -7,10 +7,7 @@
         <w:pStyle w:val="Title"/>
       </w:pPr>
       <w:r>
-        <w:t>Paper</w:t>
-      </w:r>
-      <w:r>
-        <w:t xml:space="preserve"> Title</w:t>
+        <w:t xml:space="preserve">Paper Title</w:t>
       </w:r>
     </w:p>
     <w:p>
@@ -24,13 +21,7 @@
         <w:pStyle w:val="Subtitle"/>
       </w:pPr>
       <w:r>
-        <w:t xml:space="preserve"> </w:t>
-      </w:r>
-      <w:r>
-        <w:t xml:space="preserve">(First Name Last Name) </w:t>
-      </w:r>
-      <w:r>
-        <w:t>Author</w:t>
+        <w:t xml:space="preserve"> (First Name Last Name) Author</w:t>
       </w:r>
       <w:r>
         <w:rPr>
@@ -88,35 +79,7 @@
           <w:sz w:val="20"/>
           <w:szCs w:val="20"/>
         </w:rPr>
-        <w:t>Department of Systems Engineering</w:t>
-      </w:r>
-      <w:r>
-        <w:rPr>
-          <w:sz w:val="20"/>
-          <w:szCs w:val="20"/>
-        </w:rPr>
-        <w:t xml:space="preserve">, </w:t>
-      </w:r>
-      <w:r>
-        <w:rPr>
-          <w:sz w:val="20"/>
-          <w:szCs w:val="20"/>
-        </w:rPr>
-        <w:t xml:space="preserve">United States Military Academy, </w:t>
-      </w:r>
-      <w:r>
-        <w:rPr>
-          <w:sz w:val="20"/>
-          <w:szCs w:val="20"/>
-        </w:rPr>
-        <w:t>West Point, New York</w:t>
-      </w:r>
-      <w:r>
-        <w:rPr>
-          <w:sz w:val="20"/>
-          <w:szCs w:val="20"/>
-        </w:rPr>
-        <w:t xml:space="preserve"> 10996</w:t>
+        <w:t xml:space="preserve">Department of Systems Engineering, United States Military Academy, West Point, New York 10996</w:t>
       </w:r>
     </w:p>
     <w:p>
@@ -151,14 +114,7 @@
           <w:sz w:val="20"/>
           <w:szCs w:val="20"/>
         </w:rPr>
-        <w:t>Author2 Affiliation</w:t>
-      </w:r>
-      <w:r>
-        <w:rPr>
-          <w:sz w:val="20"/>
-          <w:szCs w:val="20"/>
-        </w:rPr>
-        <w:t xml:space="preserve"> (if different from Author</w:t>
+        <w:t xml:space="preserve">Author2 Affiliation (if different from Author</w:t>
       </w:r>
       <w:r>
         <w:rPr>
@@ -208,21 +164,7 @@
           <w:sz w:val="20"/>
           <w:szCs w:val="20"/>
         </w:rPr>
-        <w:t>Author3 Affiliation</w:t>
-      </w:r>
-      <w:r>
-        <w:rPr>
-          <w:sz w:val="20"/>
-          <w:szCs w:val="20"/>
-        </w:rPr>
-        <w:t xml:space="preserve"> (if different from Author</w:t>
-      </w:r>
-      <w:r>
-        <w:rPr>
-          <w:sz w:val="20"/>
-          <w:szCs w:val="20"/>
-        </w:rPr>
-        <w:t xml:space="preserve">s </w:t>
+        <w:t xml:space="preserve">Author3 Affiliation (if different from Authors </w:t>
       </w:r>
       <w:r>
         <w:rPr>
@@ -230,15 +172,7 @@
           <w:szCs w:val="20"/>
           <w:vertAlign w:val="superscript"/>
         </w:rPr>
-        <w:t>1</w:t>
-      </w:r>
-      <w:r>
-        <w:rPr>
-          <w:sz w:val="20"/>
-          <w:szCs w:val="20"/>
-          <w:vertAlign w:val="superscript"/>
-        </w:rPr>
-        <w:t>&amp;2</w:t>
+        <w:t>1&amp;2</w:t>
       </w:r>
       <w:r>
         <w:rPr>
@@ -301,17 +235,7 @@
           <w:szCs w:val="20"/>
           <w:u w:val="none"/>
         </w:rPr>
-        <w:t xml:space="preserve">(use an email that will </w:t>
-      </w:r>
-      <w:r>
-        <w:rPr>
-          <w:rStyle w:val="Hyperlink"/>
-          <w:color w:val="000000" w:themeColor="text1"/>
-          <w:sz w:val="20"/>
-          <w:szCs w:val="20"/>
-          <w:u w:val="none"/>
-        </w:rPr>
-        <w:t>not expire after graduation)</w:t>
+        <w:t xml:space="preserve">(use an email that will not expire after graduation)</w:t>
       </w:r>
     </w:p>
     <w:p>
@@ -341,183 +265,21 @@
           <w:sz w:val="20"/>
           <w:szCs w:val="20"/>
         </w:rPr>
-        <w:t>Author Note</w:t>
-      </w:r>
-      <w:r>
-        <w:rPr>
-          <w:b/>
+        <w:t xml:space="preserve">Author Note: </w:t>
+      </w:r>
+      <w:r>
+        <w:rPr>
           <w:sz w:val="20"/>
           <w:szCs w:val="20"/>
         </w:rPr>
-        <w:t xml:space="preserve">: </w:t>
-      </w:r>
-      <w:r>
-        <w:rPr>
-          <w:sz w:val="20"/>
-          <w:szCs w:val="20"/>
-        </w:rPr>
-        <w:t>A</w:t>
-      </w:r>
-      <w:r>
-        <w:rPr>
-          <w:sz w:val="20"/>
-          <w:szCs w:val="20"/>
-        </w:rPr>
-        <w:t xml:space="preserve"> brief</w:t>
-      </w:r>
-      <w:r>
-        <w:rPr>
-          <w:sz w:val="20"/>
-          <w:szCs w:val="20"/>
-        </w:rPr>
-        <w:t xml:space="preserve"> </w:t>
-      </w:r>
-      <w:r>
-        <w:rPr>
-          <w:sz w:val="20"/>
-          <w:szCs w:val="20"/>
-        </w:rPr>
-        <w:t xml:space="preserve">biographical </w:t>
-      </w:r>
-      <w:r>
-        <w:rPr>
-          <w:sz w:val="20"/>
-          <w:szCs w:val="22"/>
-        </w:rPr>
-        <w:t>sketch of the contributing authors</w:t>
-      </w:r>
-      <w:r>
-        <w:rPr>
-          <w:sz w:val="20"/>
-          <w:szCs w:val="22"/>
-        </w:rPr>
-        <w:t xml:space="preserve"> goes here</w:t>
-      </w:r>
-      <w:r>
-        <w:rPr>
-          <w:sz w:val="20"/>
-          <w:szCs w:val="22"/>
-        </w:rPr>
-        <w:t>. It</w:t>
-      </w:r>
-      <w:r>
-        <w:rPr>
-          <w:sz w:val="20"/>
-          <w:szCs w:val="22"/>
-        </w:rPr>
-        <w:t xml:space="preserve"> may include </w:t>
-      </w:r>
-      <w:r>
-        <w:rPr>
-          <w:sz w:val="20"/>
-          <w:szCs w:val="22"/>
-        </w:rPr>
-        <w:t>acknowledgment of funding sources, expressions of gratitude to research assistants</w:t>
-      </w:r>
-      <w:r>
-        <w:rPr>
-          <w:sz w:val="20"/>
-          <w:szCs w:val="22"/>
-        </w:rPr>
-        <w:t>,</w:t>
-      </w:r>
-      <w:r>
-        <w:rPr>
-          <w:sz w:val="20"/>
-          <w:szCs w:val="22"/>
-        </w:rPr>
-        <w:t xml:space="preserve"> and contact information for the author</w:t>
-      </w:r>
-      <w:r>
-        <w:rPr>
-          <w:sz w:val="20"/>
-          <w:szCs w:val="22"/>
-        </w:rPr>
-        <w:t xml:space="preserve"> who will handle requests</w:t>
-      </w:r>
-      <w:r>
-        <w:rPr>
-          <w:sz w:val="20"/>
-          <w:szCs w:val="22"/>
-        </w:rPr>
-        <w:t>.</w:t>
-      </w:r>
-      <w:r>
-        <w:rPr>
-          <w:sz w:val="20"/>
-          <w:szCs w:val="22"/>
-        </w:rPr>
-        <w:t xml:space="preserve"> </w:t>
-      </w:r>
-      <w:r>
-        <w:rPr>
-          <w:sz w:val="20"/>
-          <w:szCs w:val="22"/>
-        </w:rPr>
-        <w:t>Projects written by</w:t>
-      </w:r>
-      <w:r>
-        <w:rPr>
-          <w:sz w:val="20"/>
-          <w:szCs w:val="22"/>
-        </w:rPr>
-        <w:t xml:space="preserve"> cadets and ROTC students should include a</w:t>
-      </w:r>
-      <w:r>
-        <w:rPr>
-          <w:sz w:val="20"/>
-          <w:szCs w:val="22"/>
-        </w:rPr>
-        <w:t xml:space="preserve"> disclosure statement</w:t>
-      </w:r>
-      <w:r>
-        <w:rPr>
-          <w:sz w:val="20"/>
-          <w:szCs w:val="22"/>
-        </w:rPr>
-        <w:t xml:space="preserve"> similar to, “</w:t>
-      </w:r>
-      <w:r>
-        <w:rPr>
-          <w:sz w:val="20"/>
-          <w:szCs w:val="22"/>
-        </w:rPr>
-        <w:t>The views</w:t>
-      </w:r>
-      <w:r>
-        <w:rPr>
-          <w:sz w:val="20"/>
-          <w:szCs w:val="22"/>
-        </w:rPr>
-        <w:t xml:space="preserve"> </w:t>
-      </w:r>
-      <w:r>
-        <w:rPr>
-          <w:sz w:val="20"/>
-          <w:szCs w:val="22"/>
-        </w:rPr>
-        <w:t>expressed herein are those of the authors and do not reflect the position of the United States Military Academy, the Department</w:t>
-      </w:r>
-      <w:r>
-        <w:rPr>
-          <w:sz w:val="20"/>
-          <w:szCs w:val="22"/>
-        </w:rPr>
-        <w:t xml:space="preserve"> </w:t>
-      </w:r>
-      <w:r>
-        <w:rPr>
-          <w:sz w:val="20"/>
-          <w:szCs w:val="22"/>
-        </w:rPr>
-        <w:t>of the Army, or the Department of Defense.</w:t>
-      </w:r>
-      <w:r>
-        <w:rPr>
-          <w:sz w:val="20"/>
-          <w:szCs w:val="22"/>
-        </w:rPr>
-        <w:t>”</w:t>
+        <w:t xml:space="preserve">A brief biographical </w:t>
+      </w:r>
+      <w:r>
+        <w:rPr>
+          <w:sz w:val="20"/>
+          <w:szCs w:val="22"/>
+        </w:rPr>
+        <w:t xml:space="preserve">sketch of the contributing authors goes here. It may include acknowledgment of funding sources, expressions of gratitude to research assistants, and contact information for the author who will handle requests. Projects written by cadets and ROTC students should include a disclosure statement similar to, “The views expressed herein are those of the authors and do not reflect the position of the United States Military Academy, the Department of the Army, or the Department of Defense.”</w:t>
       </w:r>
     </w:p>
     <w:p>
@@ -537,6 +299,61 @@
     <w:p>
       <w:pPr>
         <w:pStyle w:val="AuthorInfo"/>
+        <w:spacing w:line="240" w:lineRule="auto"/>
+        <w:jc w:val="both"/>
+        <w:rPr>
+          <w:sz w:val="20"/>
+          <w:szCs w:val="22"/>
+        </w:rPr>
+      </w:pPr>
+      <w:r>
+        <w:rPr>
+          <w:b/>
+          <w:sz w:val="20"/>
+          <w:szCs w:val="20"/>
+        </w:rPr>
+        <w:t xml:space="preserve">AI Use Disclosure: </w:t>
+      </w:r>
+      <w:r>
+        <w:rPr>
+          <w:sz w:val="20"/>
+          <w:szCs w:val="20"/>
+        </w:rPr>
+        <w:t xml:space="preserve">All papers must include a statement describing how generative AI tools were used. Complete and keep the following statement: </w:t>
+      </w:r>
+      <w:r>
+        <w:rPr>
+          <w:i/>
+          <w:sz w:val="20"/>
+          <w:szCs w:val="20"/>
+        </w:rPr>
+        <w:t xml:space="preserve">“Generative AI tools were used to support the following activities: ________. The authors reviewed and verified all generated material, consulted the original sources, and accept responsibility for all claims, citations, analysis, and conclusions.”</w:t>
+      </w:r>
+      <w:r>
+        <w:rPr>
+          <w:sz w:val="20"/>
+          <w:szCs w:val="20"/>
+        </w:rPr>
+        <w:t xml:space="preserve"> The conference chair will screen all submissions for AI-generated text using Pangram (pangram.com). Papers that show excessive reliance on generative AI for writing may be disqualified from competing for best paper awards.</w:t>
+      </w:r>
+    </w:p>
+    <w:p>
+      <w:pPr>
+        <w:pStyle w:val="AuthorInfo"/>
+        <w:tabs>
+          <w:tab w:val="clear" w:pos="8640"/>
+        </w:tabs>
+        <w:spacing w:line="240" w:lineRule="auto"/>
+        <w:jc w:val="left"/>
+        <w:rPr>
+          <w:sz w:val="20"/>
+          <w:szCs w:val="22"/>
+        </w:rPr>
+      </w:pPr>
+    </w:p>
+    <w:p>
+      <w:pPr>
+        <w:pStyle w:val="AuthorInfo"/>
         <w:tabs>
           <w:tab w:val="clear" w:pos="8640"/>
         </w:tabs>
@@ -774,39 +591,7 @@
           <w:sz w:val="20"/>
           <w:szCs w:val="22"/>
         </w:rPr>
-        <w:t>The file name is lastname</w:t>
-      </w:r>
-      <w:r>
-        <w:rPr>
-          <w:b/>
-          <w:sz w:val="20"/>
-          <w:szCs w:val="22"/>
-        </w:rPr>
-        <w:t>&lt;&lt;</w:t>
-      </w:r>
-      <w:r>
-        <w:rPr>
-          <w:b/>
-          <w:sz w:val="20"/>
-          <w:szCs w:val="22"/>
-        </w:rPr>
-        <w:t>number</w:t>
-      </w:r>
-      <w:r>
-        <w:rPr>
-          <w:b/>
-          <w:sz w:val="20"/>
-          <w:szCs w:val="22"/>
-        </w:rPr>
-        <w:t>&gt;&gt;</w:t>
-      </w:r>
-      <w:r>
-        <w:rPr>
-          <w:b/>
-          <w:sz w:val="20"/>
-          <w:szCs w:val="22"/>
-        </w:rPr>
-        <w:t>.docx (OR lastnamenumber.doc)</w:t>
+        <w:t>The file name is lastname&lt;&lt;number&gt;&gt;.docx (OR lastnamenumber.doc)</w:t>
       </w:r>
       <w:r>
         <w:rPr>
@@ -963,31 +748,7 @@
             <w:sz w:val="20"/>
             <w:szCs w:val="22"/>
           </w:rPr>
-          <w:t>donald</w:t>
-        </w:r>
-        <w:r>
-          <w:rPr>
-            <w:rStyle w:val="Hyperlink"/>
-            <w:sz w:val="20"/>
-            <w:szCs w:val="22"/>
-          </w:rPr>
-          <w:t>.</w:t>
-        </w:r>
-        <w:r>
-          <w:rPr>
-            <w:rStyle w:val="Hyperlink"/>
-            <w:sz w:val="20"/>
-            <w:szCs w:val="22"/>
-          </w:rPr>
-          <w:t>koban</w:t>
-        </w:r>
-        <w:r>
-          <w:rPr>
-            <w:rStyle w:val="Hyperlink"/>
-            <w:sz w:val="20"/>
-            <w:szCs w:val="22"/>
-          </w:rPr>
-          <w:t>@westpoint.edu</w:t>
+          <w:t>donald.koban@westpoint.edu</w:t>
         </w:r>
       </w:hyperlink>
       <w:r>
@@ -1030,13 +791,7 @@
         <w:pStyle w:val="Heading1"/>
       </w:pPr>
       <w:r>
-        <w:t xml:space="preserve">1. </w:t>
-      </w:r>
-      <w:r>
-        <w:t>Heading</w:t>
-      </w:r>
-      <w:r>
-        <w:t xml:space="preserve"> Level 1</w:t>
+        <w:t xml:space="preserve">1. Heading Level 1</w:t>
       </w:r>
     </w:p>
     <w:p>
@@ -1076,10 +831,7 @@
         <w:pStyle w:val="BodyText"/>
       </w:pPr>
       <w:r>
-        <w:t>Sections can be further</w:t>
-      </w:r>
-      <w:r>
-        <w:t xml:space="preserve"> divided into subsections with headings.  </w:t>
+        <w:t xml:space="preserve">Sections can be further divided into subsections with headings.  </w:t>
       </w:r>
     </w:p>
     <w:p>
@@ -1087,13 +839,7 @@
         <w:pStyle w:val="HeadingLevel2"/>
       </w:pPr>
       <w:r>
-        <w:t xml:space="preserve">1.1 </w:t>
-      </w:r>
-      <w:r>
-        <w:t>Heading</w:t>
-      </w:r>
-      <w:r>
-        <w:t xml:space="preserve"> Level 2</w:t>
+        <w:t xml:space="preserve">1.1 Heading Level 2</w:t>
       </w:r>
     </w:p>
     <w:p>
@@ -1109,22 +855,7 @@
         <w:pStyle w:val="BodyText"/>
       </w:pPr>
       <w:r>
-        <w:t>The</w:t>
-      </w:r>
-      <w:r>
-        <w:t xml:space="preserve"> second and all subsequent paragraph should </w:t>
-      </w:r>
-      <w:r>
-        <w:t xml:space="preserve">also </w:t>
-      </w:r>
-      <w:r>
-        <w:t>be indented (0.</w:t>
-      </w:r>
-      <w:r>
-        <w:t>5</w:t>
-      </w:r>
-      <w:r>
-        <w:t xml:space="preserve"> inches) as here with no line spacing before the line.</w:t>
+        <w:t xml:space="preserve">The second and all subsequent paragraph should also be indented (0.5 inches) as here with no line spacing before the line.</w:t>
       </w:r>
     </w:p>
     <w:p>
@@ -1133,13 +864,7 @@
       </w:pPr>
       <w:r>
         <w:lastRenderedPageBreak/>
-        <w:t xml:space="preserve">1.1.1 </w:t>
-      </w:r>
-      <w:r>
-        <w:t>Heading</w:t>
-      </w:r>
-      <w:r>
-        <w:t xml:space="preserve"> Level 3 </w:t>
+        <w:t xml:space="preserve">1.1.1 Heading Level 3 </w:t>
       </w:r>
     </w:p>
     <w:p>
@@ -1274,8 +999,6 @@
       </w:r>
       <w:r>
         <w:t xml:space="preserve">             </w:t>
-      </w:r>
-      <w:r>
         <w:tab/>
         <w:t>(1)</w:t>
       </w:r>
@@ -1341,13 +1064,7 @@
         <w:t xml:space="preserve"> </w:t>
       </w:r>
       <w:r>
-        <w:t xml:space="preserve">a minimum </w:t>
-      </w:r>
-      <w:r>
-        <w:t>two</w:t>
-      </w:r>
-      <w:r>
-        <w:t xml:space="preserve"> line spaces between tables and text.</w:t>
+        <w:t xml:space="preserve">a minimum two line spaces between tables and text.</w:t>
       </w:r>
     </w:p>
     <w:p>
@@ -1355,10 +1072,7 @@
         <w:pStyle w:val="TableLabel"/>
       </w:pPr>
       <w:r>
-        <w:t xml:space="preserve">Table 1. </w:t>
-      </w:r>
-      <w:r>
-        <w:t>Correlations Among and Descriptive Statistics For Key Study Variables</w:t>
+        <w:t xml:space="preserve">Table 1. Correlations Among and Descriptive Statistics For Key Study Variables</w:t>
       </w:r>
     </w:p>
     <w:tbl>
@@ -2846,8 +2560,6 @@
       </w:pPr>
       <w:r>
         <w:tab/>
-      </w:r>
-      <w:r>
         <w:t>All figures should be positioned at the top of the page when possible. All figures should be numbered consecutively and</w:t>
       </w:r>
       <w:r>
@@ -3041,13 +2753,7 @@
         <w:pStyle w:val="Heading1"/>
       </w:pPr>
       <w:r>
-        <w:t>4</w:t>
-      </w:r>
-      <w:r>
-        <w:t xml:space="preserve">. </w:t>
-      </w:r>
-      <w:r>
-        <w:t>Citations and References</w:t>
+        <w:t xml:space="preserve">4. Citations and References</w:t>
       </w:r>
     </w:p>
     <w:p>
@@ -3111,37 +2817,7 @@
       </w:pPr>
       <w:r>
         <w:lastRenderedPageBreak/>
-        <w:t>Note that APA uses the "hanging indent" style for references</w:t>
-      </w:r>
-      <w:r>
-        <w:t xml:space="preserve">.  </w:t>
-      </w:r>
-      <w:r>
-        <w:t>T</w:t>
-      </w:r>
-      <w:r>
-        <w:t xml:space="preserve">he easiest way to </w:t>
-      </w:r>
-      <w:r>
-        <w:t>create hanging indents</w:t>
-      </w:r>
-      <w:r>
-        <w:t xml:space="preserve"> is to type each reference without worrying about the hanging indent</w:t>
-      </w:r>
-      <w:r>
-        <w:t xml:space="preserve">.  </w:t>
-      </w:r>
-      <w:r>
-        <w:t xml:space="preserve">Then, when you are finished, select all the references </w:t>
-      </w:r>
-      <w:r>
-        <w:t>at once</w:t>
-      </w:r>
-      <w:r>
-        <w:t xml:space="preserve"> and </w:t>
-      </w:r>
-      <w:r>
-        <w:t>apply the hanging indent</w:t>
+        <w:t xml:space="preserve">Note that APA uses the "hanging indent" style for references.  The easiest way to create hanging indents is to type each reference without worrying about the hanging indent.  Then, when you are finished, select all the references at once and apply the hanging indent</w:t>
       </w:r>
       <w:r>
         <w:rPr>

</xml_diff>

<commit_message>
Require AI disclosure on all papers and accept PDF submissions
- Add a "no generative AI tools were used" statement for authors who
  did not use AI, on the site and in both templates
- Spec table: accept PDF (from the LaTeX template) as well as Word,
  and list lastname.pdf naming
- LaTeX template abstract: note PDF submission and file naming

Co-Authored-By: Claude Opus 5.5 <noreply@anthropic.com>
Claude-Session: https://claude.ai/code/session_01JHp3dG7BHjUqck1HCFwd7M
</commit_message>
<xml_diff>
--- a/files/GDRKMCC-27_Paper_Template.docx
+++ b/files/GDRKMCC-27_Paper_Template.docx
@@ -319,7 +319,7 @@
           <w:sz w:val="20"/>
           <w:szCs w:val="20"/>
         </w:rPr>
-        <w:t xml:space="preserve">All papers must include a statement describing how generative AI tools were used. Complete and keep the following statement: </w:t>
+        <w:t xml:space="preserve">All papers must include one of the following statements, whether or not AI was used. If generative AI tools were used, complete and keep: </w:t>
       </w:r>
       <w:r>
         <w:rPr>
@@ -328,6 +328,21 @@
           <w:szCs w:val="20"/>
         </w:rPr>
         <w:t xml:space="preserve">“Generative AI tools were used to support the following activities: ________. The authors reviewed and verified all generated material, consulted the original sources, and accept responsibility for all claims, citations, analysis, and conclusions.”</w:t>
+      </w:r>
+      <w:r>
+        <w:rPr>
+          <w:sz w:val="20"/>
+          <w:szCs w:val="20"/>
+        </w:rPr>
+        <w:t xml:space="preserve"> If no generative AI tools were used, write: </w:t>
+      </w:r>
+      <w:r>
+        <w:rPr>
+          <w:i/>
+          <w:sz w:val="20"/>
+          <w:szCs w:val="20"/>
+        </w:rPr>
+        <w:t xml:space="preserve">“No generative AI tools were used in the preparation of this paper.”</w:t>
       </w:r>
       <w:r>
         <w:rPr>

</xml_diff>

<commit_message>
Move AI use disclosure to an Acknowledgments section at the end
Match the 2026 proceedings layout: the disclosure now goes in an
Acknowledgments section just before References instead of after the
Author Note, in both templates, on the site, and in the README.

Co-Authored-By: Claude Opus 5.5 <noreply@anthropic.com>
Claude-Session: https://claude.ai/code/session_01JHp3dG7BHjUqck1HCFwd7M
</commit_message>
<xml_diff>
--- a/files/GDRKMCC-27_Paper_Template.docx
+++ b/files/GDRKMCC-27_Paper_Template.docx
@@ -280,76 +280,6 @@
           <w:szCs w:val="22"/>
         </w:rPr>
         <w:t xml:space="preserve">sketch of the contributing authors goes here. It may include acknowledgment of funding sources, expressions of gratitude to research assistants, and contact information for the author who will handle requests. Projects written by cadets and ROTC students should include a disclosure statement similar to, “The views expressed herein are those of the authors and do not reflect the position of the United States Military Academy, the Department of the Army, or the Department of Defense.”</w:t>
-      </w:r>
-    </w:p>
-    <w:p>
-      <w:pPr>
-        <w:pStyle w:val="AuthorInfo"/>
-        <w:tabs>
-          <w:tab w:val="clear" w:pos="8640"/>
-        </w:tabs>
-        <w:spacing w:line="240" w:lineRule="auto"/>
-        <w:jc w:val="left"/>
-        <w:rPr>
-          <w:sz w:val="20"/>
-          <w:szCs w:val="22"/>
-        </w:rPr>
-      </w:pPr>
-    </w:p>
-    <w:p>
-      <w:pPr>
-        <w:pStyle w:val="AuthorInfo"/>
-        <w:spacing w:line="240" w:lineRule="auto"/>
-        <w:jc w:val="both"/>
-        <w:rPr>
-          <w:sz w:val="20"/>
-          <w:szCs w:val="22"/>
-        </w:rPr>
-      </w:pPr>
-      <w:r>
-        <w:rPr>
-          <w:b/>
-          <w:sz w:val="20"/>
-          <w:szCs w:val="20"/>
-        </w:rPr>
-        <w:t xml:space="preserve">AI Use Disclosure: </w:t>
-      </w:r>
-      <w:r>
-        <w:rPr>
-          <w:sz w:val="20"/>
-          <w:szCs w:val="20"/>
-        </w:rPr>
-        <w:t xml:space="preserve">All papers must include one of the following statements, whether or not AI was used. If generative AI tools were used, complete and keep: </w:t>
-      </w:r>
-      <w:r>
-        <w:rPr>
-          <w:i/>
-          <w:sz w:val="20"/>
-          <w:szCs w:val="20"/>
-        </w:rPr>
-        <w:t xml:space="preserve">“Generative AI tools were used to support the following activities: ________. The authors reviewed and verified all generated material, consulted the original sources, and accept responsibility for all claims, citations, analysis, and conclusions.”</w:t>
-      </w:r>
-      <w:r>
-        <w:rPr>
-          <w:sz w:val="20"/>
-          <w:szCs w:val="20"/>
-        </w:rPr>
-        <w:t xml:space="preserve"> If no generative AI tools were used, write: </w:t>
-      </w:r>
-      <w:r>
-        <w:rPr>
-          <w:i/>
-          <w:sz w:val="20"/>
-          <w:szCs w:val="20"/>
-        </w:rPr>
-        <w:t xml:space="preserve">“No generative AI tools were used in the preparation of this paper.”</w:t>
-      </w:r>
-      <w:r>
-        <w:rPr>
-          <w:sz w:val="20"/>
-          <w:szCs w:val="20"/>
-        </w:rPr>
-        <w:t xml:space="preserve"> The conference chair will screen all submissions for AI-generated text using Pangram (pangram.com). Papers that show excessive reliance on generative AI for writing may be disqualified from competing for best paper awards.</w:t>
       </w:r>
     </w:p>
     <w:p>
@@ -2872,6 +2802,45 @@
         </w:docPartObj>
       </w:sdtPr>
       <w:sdtContent>
+        <w:p>
+          <w:pPr>
+            <w:pStyle w:val="Heading1"/>
+          </w:pPr>
+          <w:r>
+            <w:t>Acknowledgments</w:t>
+          </w:r>
+        </w:p>
+        <w:p>
+          <w:pPr>
+            <w:pStyle w:val="BodyText"/>
+          </w:pPr>
+          <w:r>
+            <w:t xml:space="preserve">Acknowledge sponsors, advisors, and others who supported this work here. Every paper must also end this section with an AI use disclosure, whether or not AI was used. If generative AI tools were used, complete and keep: </w:t>
+          </w:r>
+          <w:r>
+            <w:rPr>
+              <w:i/>
+            </w:rPr>
+            <w:t xml:space="preserve">“Generative AI tools were used to support the following activities: ________. The authors reviewed and verified all generated material, consulted the original sources, and accept responsibility for all claims, citations, analysis, and conclusions.”</w:t>
+          </w:r>
+          <w:r>
+            <w:t xml:space="preserve"> If no generative AI tools were used, write: </w:t>
+          </w:r>
+          <w:r>
+            <w:rPr>
+              <w:i/>
+            </w:rPr>
+            <w:t xml:space="preserve">“No generative AI tools were used in the preparation of this paper.”</w:t>
+          </w:r>
+        </w:p>
+        <w:p>
+          <w:pPr>
+            <w:pStyle w:val="BodyText"/>
+          </w:pPr>
+          <w:r>
+            <w:t xml:space="preserve">The conference chair will screen all submissions for AI-generated text using Pangram (pangram.com). Papers that show excessive reliance on generative AI for writing may be disqualified from competing for best paper awards.</w:t>
+          </w:r>
+        </w:p>
         <w:p>
           <w:pPr>
             <w:pStyle w:val="Heading1"/>

</xml_diff>

<commit_message>
Number the Acknowledgments and References headings
Match the 2026 proceedings example (GDRKMCC26_1), which uses a numbered
Acknowledgments section immediately before a numbered References section.

Co-Authored-By: Claude Opus 5.5 <noreply@anthropic.com>
Claude-Session: https://claude.ai/code/session_01JHp3dG7BHjUqck1HCFwd7M
</commit_message>
<xml_diff>
--- a/files/GDRKMCC-27_Paper_Template.docx
+++ b/files/GDRKMCC-27_Paper_Template.docx
@@ -2807,7 +2807,7 @@
             <w:pStyle w:val="Heading1"/>
           </w:pPr>
           <w:r>
-            <w:t>Acknowledgments</w:t>
+            <w:t>5. Acknowledgments</w:t>
           </w:r>
         </w:p>
         <w:p>
@@ -2846,7 +2846,7 @@
             <w:pStyle w:val="Heading1"/>
           </w:pPr>
           <w:r>
-            <w:t>5. References</w:t>
+            <w:t>6. References</w:t>
           </w:r>
         </w:p>
         <w:sdt>

</xml_diff>

<commit_message>
Give the AI disclosure its own Generative AI Disclosure section
A dedicated, required section is harder to delete along with an empty
Acknowledgments and easier to verify during screening. Acknowledgments
stays as an optional section before it; References follows.

Co-Authored-By: Claude Opus 5.5 <noreply@anthropic.com>
Claude-Session: https://claude.ai/code/session_01JHp3dG7BHjUqck1HCFwd7M
</commit_message>
<xml_diff>
--- a/files/GDRKMCC-27_Paper_Template.docx
+++ b/files/GDRKMCC-27_Paper_Template.docx
@@ -2815,7 +2815,23 @@
             <w:pStyle w:val="BodyText"/>
           </w:pPr>
           <w:r>
-            <w:t xml:space="preserve">Acknowledge sponsors, advisors, and others who supported this work here. Every paper must also end this section with an AI use disclosure, whether or not AI was used. If generative AI tools were used, complete and keep: </w:t>
+            <w:t xml:space="preserve">Optional. Acknowledge sponsors, advisors, and others who supported this work here. Delete this section if it is not needed.</w:t>
+          </w:r>
+        </w:p>
+        <w:p>
+          <w:pPr>
+            <w:pStyle w:val="Heading1"/>
+          </w:pPr>
+          <w:r>
+            <w:t>6. Generative AI Disclosure</w:t>
+          </w:r>
+        </w:p>
+        <w:p>
+          <w:pPr>
+            <w:pStyle w:val="BodyText"/>
+          </w:pPr>
+          <w:r>
+            <w:t xml:space="preserve">Required in every paper, whether or not AI was used. If generative AI tools were used, complete and keep: </w:t>
           </w:r>
           <w:r>
             <w:rPr>
@@ -2846,7 +2862,7 @@
             <w:pStyle w:val="Heading1"/>
           </w:pPr>
           <w:r>
-            <w:t>6. References</w:t>
+            <w:t>7. References</w:t>
           </w:r>
         </w:p>
         <w:sdt>

</xml_diff>

<commit_message>
Remove the Acknowledgments section from both templates
The Generative AI Disclosure is now section 5, immediately before
References (section 6).

Co-Authored-By: Claude Opus 5.5 <noreply@anthropic.com>
Claude-Session: https://claude.ai/code/session_01JHp3dG7BHjUqck1HCFwd7M
</commit_message>
<xml_diff>
--- a/files/GDRKMCC-27_Paper_Template.docx
+++ b/files/GDRKMCC-27_Paper_Template.docx
@@ -2807,23 +2807,7 @@
             <w:pStyle w:val="Heading1"/>
           </w:pPr>
           <w:r>
-            <w:t>5. Acknowledgments</w:t>
-          </w:r>
-        </w:p>
-        <w:p>
-          <w:pPr>
-            <w:pStyle w:val="BodyText"/>
-          </w:pPr>
-          <w:r>
-            <w:t xml:space="preserve">Optional. Acknowledge sponsors, advisors, and others who supported this work here. Delete this section if it is not needed.</w:t>
-          </w:r>
-        </w:p>
-        <w:p>
-          <w:pPr>
-            <w:pStyle w:val="Heading1"/>
-          </w:pPr>
-          <w:r>
-            <w:t>6. Generative AI Disclosure</w:t>
+            <w:t>5. Generative AI Disclosure</w:t>
           </w:r>
         </w:p>
         <w:p>
@@ -2862,7 +2846,7 @@
             <w:pStyle w:val="Heading1"/>
           </w:pPr>
           <w:r>
-            <w:t>7. References</w:t>
+            <w:t>6. References</w:t>
           </w:r>
         </w:p>
         <w:sdt>

</xml_diff>